<commit_message>
feat(documents): add editable document packs
</commit_message>
<xml_diff>
--- a/docs/document-templates/source/АРАВА_Договор_мастер-шаблон.docx
+++ b/docs/document-templates/source/АРАВА_Договор_мастер-шаблон.docx
@@ -10774,7 +10774,7 @@
       <w:headerReference w:type="default" r:id="rId7"/>
       <w:footerReference w:type="default" r:id="rId8"/>
       <w:pgSz w:w="11906" w:h="16838"/>
-      <w:pgMar w:top="1134" w:right="850" w:bottom="1134" w:left="1701" w:header="708" w:footer="708" w:gutter="0"/>
+      <w:pgMar w:top="850" w:right="850" w:bottom="850" w:left="1701" w:header="708" w:footer="708" w:gutter="0"/>
       <w:cols w:space="708"/>
       <w:docGrid w:linePitch="360"/>
     </w:sectPr>
@@ -10938,15 +10938,15 @@
       <w:rPr>
         <w:rFonts w:asciiTheme="minorHAnsi" w:eastAsiaTheme="minorHAnsi" w:hAnsiTheme="minorHAnsi" w:cstheme="minorBidi"/>
         <w:kern w:val="2"/>
-        <w:sz w:val="24"/>
-        <w:szCs w:val="24"/>
+        <w:sz w:val="22"/>
+        <w:szCs w:val="22"/>
         <w:lang w:val="ru-RU" w:eastAsia="en-US" w:bidi="ar-SA"/>
         <w14:ligatures w14:val="standardContextual"/>
       </w:rPr>
     </w:rPrDefault>
     <w:pPrDefault>
       <w:pPr>
-        <w:spacing w:after="160" w:line="278" w:lineRule="auto"/>
+        <w:spacing w:after="80" w:line="264" w:lineRule="auto"/>
       </w:pPr>
     </w:pPrDefault>
   </w:docDefaults>

</xml_diff>